<commit_message>
Arreglado boton de inscripciones, Enlace Ley proteccion datos, Solo 1 inscripcion por modalidad
</commit_message>
<xml_diff>
--- a/DocumentacionCampeonatoLive_v2.docx
+++ b/DocumentacionCampeonatoLive_v2.docx
@@ -21460,9 +21460,6 @@
       <w:pPr>
         <w:pStyle w:val="Heading3"/>
         <w:spacing w:before="280" w:after="120"/>
-        <w:rPr/>
-      </w:pPr>
-      <w:r>
         <w:rPr>
           <w:rFonts w:eastAsia="Arial" w:cs="Arial"/>
           <w:b/>
@@ -21471,49 +21468,74 @@
           <w:sz w:val="24"/>
           <w:szCs w:val="24"/>
         </w:rPr>
-        <w:t>6.5.4. Backend — Capa de Controladores (API REST)</w:t>
-      </w:r>
-    </w:p>
-    <w:p>
-      <w:pPr>
-        <w:pStyle w:val="Normal"/>
-        <w:spacing w:before="0" w:after="160"/>
-        <w:rPr/>
       </w:pPr>
       <w:r>
         <w:rPr>
           <w:rFonts w:eastAsia="Arial" w:cs="Arial"/>
-          <w:color w:val="1C1C1C"/>
-          <w:sz w:val="22"/>
-          <w:szCs w:val="22"/>
-        </w:rPr>
-        <w:t>A continuación se detallan todos los endpoints expuestos por la API REST, agrupados por controlador:</w:t>
-      </w:r>
-    </w:p>
-    <w:p>
-      <w:pPr>
-        <w:pStyle w:val="Normal"/>
-        <w:rPr/>
-      </w:pPr>
-      <w:r>
-        <w:rPr/>
-      </w:r>
-    </w:p>
-    <w:p>
-      <w:pPr>
-        <w:pStyle w:val="Normal"/>
-        <w:spacing w:before="200" w:after="80"/>
-        <w:rPr>
-          <w:rFonts w:ascii="Arial" w:hAnsi="Arial" w:eastAsia="Arial" w:cs="Arial"/>
           <w:b/>
           <w:bCs/>
           <w:color w:val="1C1C1C"/>
-          <w:sz w:val="22"/>
-          <w:szCs w:val="22"/>
-          <w:u w:val="single"/>
-        </w:rPr>
-      </w:pPr>
-      <w:r>
+          <w:sz w:val="24"/>
+          <w:szCs w:val="24"/>
+        </w:rPr>
+      </w:r>
+    </w:p>
+    <w:p>
+      <w:pPr>
+        <w:pStyle w:val="Heading3"/>
+        <w:spacing w:before="280" w:after="120"/>
+        <w:rPr>
+          <w:rFonts w:eastAsia="Arial" w:cs="Arial"/>
+          <w:b/>
+          <w:bCs/>
+          <w:color w:val="1C1C1C"/>
+          <w:sz w:val="24"/>
+          <w:szCs w:val="24"/>
+        </w:rPr>
+      </w:pPr>
+      <w:r>
+        <w:rPr>
+          <w:rFonts w:eastAsia="Arial" w:cs="Arial"/>
+          <w:b/>
+          <w:bCs/>
+          <w:color w:val="1C1C1C"/>
+          <w:sz w:val="24"/>
+          <w:szCs w:val="24"/>
+        </w:rPr>
+      </w:r>
+      <w:r>
+        <w:br w:type="page"/>
+      </w:r>
+    </w:p>
+    <w:p>
+      <w:pPr>
+        <w:pStyle w:val="Heading3"/>
+        <w:spacing w:before="280" w:after="120"/>
+        <w:rPr>
+          <w:rFonts w:eastAsia="Arial" w:cs="Arial"/>
+          <w:b/>
+          <w:bCs/>
+          <w:color w:val="1C1C1C"/>
+          <w:sz w:val="24"/>
+          <w:szCs w:val="24"/>
+        </w:rPr>
+      </w:pPr>
+      <w:r>
+        <w:rPr>
+          <w:rFonts w:eastAsia="Arial" w:cs="Arial"/>
+          <w:b/>
+          <w:bCs/>
+          <w:color w:val="1C1C1C"/>
+          <w:sz w:val="24"/>
+          <w:szCs w:val="24"/>
+        </w:rPr>
+        <w:t>6.5.4. Backend — Capa de Controladores</w:t>
+      </w:r>
+    </w:p>
+    <w:p>
+      <w:pPr>
+        <w:pStyle w:val="Heading3"/>
+        <w:spacing w:before="280" w:after="120"/>
         <w:rPr>
           <w:rFonts w:eastAsia="Arial" w:cs="Arial"/>
           <w:b/>
@@ -21521,11 +21543,17 @@
           <w:color w:val="1C1C1C"/>
           <w:sz w:val="22"/>
           <w:szCs w:val="22"/>
-          <w:u w:val="single"/>
-        </w:rPr>
-      </w:r>
-      <w:r>
-        <w:br w:type="page"/>
+        </w:rPr>
+      </w:pPr>
+      <w:r>
+        <w:rPr>
+          <w:rFonts w:eastAsia="Arial" w:cs="Arial"/>
+          <w:b/>
+          <w:bCs/>
+          <w:color w:val="1C1C1C"/>
+          <w:sz w:val="22"/>
+          <w:szCs w:val="22"/>
+        </w:rPr>
       </w:r>
     </w:p>
     <w:p>
@@ -23333,45 +23361,6 @@
     <w:p>
       <w:pPr>
         <w:pStyle w:val="Normal"/>
-        <w:rPr/>
-      </w:pPr>
-      <w:r>
-        <w:rPr/>
-      </w:r>
-    </w:p>
-    <w:p>
-      <w:pPr>
-        <w:pStyle w:val="Normal"/>
-        <w:spacing w:before="200" w:after="80"/>
-        <w:rPr>
-          <w:rFonts w:ascii="Arial" w:hAnsi="Arial" w:eastAsia="Arial" w:cs="Arial"/>
-          <w:b/>
-          <w:bCs/>
-          <w:color w:val="1C1C1C"/>
-          <w:sz w:val="22"/>
-          <w:szCs w:val="22"/>
-          <w:u w:val="single"/>
-        </w:rPr>
-      </w:pPr>
-      <w:r>
-        <w:rPr>
-          <w:rFonts w:eastAsia="Arial" w:cs="Arial"/>
-          <w:b/>
-          <w:bCs/>
-          <w:color w:val="1C1C1C"/>
-          <w:sz w:val="22"/>
-          <w:szCs w:val="22"/>
-          <w:u w:val="single"/>
-        </w:rPr>
-        <w:br/>
-      </w:r>
-      <w:r>
-        <w:br w:type="page"/>
-      </w:r>
-    </w:p>
-    <w:p>
-      <w:pPr>
-        <w:pStyle w:val="Normal"/>
         <w:spacing w:before="0" w:after="80"/>
         <w:rPr>
           <w:rFonts w:ascii="Arial" w:hAnsi="Arial" w:eastAsia="Arial" w:cs="Arial"/>
@@ -25294,7 +25283,7 @@
           <w:sz w:val="22"/>
           <w:szCs w:val="22"/>
         </w:rPr>
-        <w:t>La interfaz de CampeonatoLive usa un tema oscuro inspirado en la estética de las competiciones de karate profesional. Los principios de diseño aplicados son: jerarquía visual clara, contraste elevado para legibilidad en entornos de poca luz (pantallas de árbitros en pabellones), bordes redondeados (rounded-2xl, rounded-xl) y uso contenido del color rojo de acento para acciones primarias y elementos de énfasis.</w:t>
+        <w:t>La interfaz de CampeonatoLive usa un tema oscuro. Los principios de diseño aplicados son:  contraste elevado para legibilidad en entornos de poca luz, bordes redondeados y uso contenido del color rojo de acento para acciones primarias y elementos de énfasis.</w:t>
       </w:r>
     </w:p>
     <w:p>
@@ -26471,15 +26460,6 @@
     <w:p>
       <w:pPr>
         <w:pStyle w:val="Normal"/>
-        <w:rPr/>
-      </w:pPr>
-      <w:r>
-        <w:rPr/>
-      </w:r>
-    </w:p>
-    <w:p>
-      <w:pPr>
-        <w:pStyle w:val="Normal"/>
         <w:spacing w:before="200" w:after="80"/>
         <w:rPr/>
       </w:pPr>
@@ -26509,7 +26489,43 @@
           <w:sz w:val="22"/>
           <w:szCs w:val="22"/>
         </w:rPr>
-        <w:t>Es la pantalla de entrada a la aplicación. Muestra todos los campeonatos disponibles organizados en un grid responsivo (1 columna en móvil, 2 en tablet, 3 en escritorio). Cada tarjeta incluye: la imagen de portada del campeonato (cargada desde la URL almacenada en BD), el nombre del campeonato en tipografía Bebas Neue, un badge con el nivel (Regional / Nacional), un badge con el estado (futuro en rojo, activo en verde, pasado en gris), la fecha de inicio y fin, y la ubicación. Encima del grid hay un campo de búsqueda que filtra las tarjetas en tiempo real usando Angular Signals (computed). Al hacer clic en una tarjeta, el router navega a /campeonato/:id.</w:t>
+        <w:t xml:space="preserve">Es </w:t>
+      </w:r>
+      <w:r>
+        <w:rPr>
+          <w:rFonts w:eastAsia="Arial" w:cs="Arial"/>
+          <w:color w:val="1C1C1C"/>
+          <w:sz w:val="22"/>
+          <w:szCs w:val="22"/>
+        </w:rPr>
+        <w:t>el home</w:t>
+      </w:r>
+      <w:r>
+        <w:rPr>
+          <w:rFonts w:eastAsia="Arial" w:cs="Arial"/>
+          <w:color w:val="1C1C1C"/>
+          <w:sz w:val="22"/>
+          <w:szCs w:val="22"/>
+        </w:rPr>
+        <w:t>. Muestra todos los campeonatos disponibles organizados en un grid responsiv</w:t>
+      </w:r>
+      <w:r>
+        <w:rPr>
+          <w:rFonts w:eastAsia="Arial" w:cs="Arial"/>
+          <w:color w:val="1C1C1C"/>
+          <w:sz w:val="22"/>
+          <w:szCs w:val="22"/>
+        </w:rPr>
+        <w:t>o</w:t>
+      </w:r>
+      <w:r>
+        <w:rPr>
+          <w:rFonts w:eastAsia="Arial" w:cs="Arial"/>
+          <w:color w:val="1C1C1C"/>
+          <w:sz w:val="22"/>
+          <w:szCs w:val="22"/>
+        </w:rPr>
+        <w:t>. Cada tarjeta incluye: la imagen de portada del campeonato, el nombre del campeonato, un badge con el nivel, un badge con el estado, la fecha de inicio y fin, y la ubicación. Encima del grid hay un campo de búsqueda que filtra las tarjetas en tiempo real usando Angular Signals . Al hacer clic en una tarjeta, el router navega a /campeonato/:id.</w:t>
       </w:r>
     </w:p>
     <w:p>
@@ -26544,16 +26560,102 @@
       <w:pPr>
         <w:pStyle w:val="Normal"/>
         <w:spacing w:before="0" w:after="160"/>
-        <w:rPr/>
-      </w:pPr>
-      <w:r>
         <w:rPr>
           <w:rFonts w:eastAsia="Arial" w:cs="Arial"/>
           <w:color w:val="1C1C1C"/>
           <w:sz w:val="22"/>
           <w:szCs w:val="22"/>
         </w:rPr>
-        <w:t>Muestra toda la información de un campeonato específico. Consta de tres secciones principales: (1) Imagen de portada a ancho completo con gradiente inferior que suaviza la transición, badges de nivel y estado superpuestos. (2) Bloque de información con nombre del campeonato en grande, fecha de inicio y fin, ubicación e icono, nivel y descripción completa. (3) Sección de categorías dividida en dos columnas (Masculino / Femenino), y dentro de cada columna las categorías agrupadas por modalidad (Kata / Kumite). Cada categoría se muestra como un ítem clicable que abre el modal de inscritos. Junto a cada categoría hay un botón 'Ver sorteo' que navega a la ruta del bracket.</w:t>
+      </w:pPr>
+      <w:r>
+        <w:rPr>
+          <w:rFonts w:eastAsia="Arial" w:cs="Arial"/>
+          <w:color w:val="1C1C1C"/>
+          <w:sz w:val="22"/>
+          <w:szCs w:val="22"/>
+        </w:rPr>
+        <w:t>Muestra toda la información de un campeonato específico. Consta de tres secciones principales:</w:t>
+      </w:r>
+    </w:p>
+    <w:p>
+      <w:pPr>
+        <w:pStyle w:val="Normal"/>
+        <w:spacing w:before="0" w:after="160"/>
+        <w:rPr>
+          <w:rFonts w:eastAsia="Arial" w:cs="Arial"/>
+          <w:color w:val="1C1C1C"/>
+          <w:sz w:val="22"/>
+          <w:szCs w:val="22"/>
+        </w:rPr>
+      </w:pPr>
+      <w:r>
+        <w:rPr>
+          <w:rFonts w:eastAsia="Arial" w:cs="Arial"/>
+          <w:color w:val="1C1C1C"/>
+          <w:sz w:val="22"/>
+          <w:szCs w:val="22"/>
+        </w:rPr>
+        <w:t>(1) Imagen de portada a ancho completo, badges de nivel y estado superpuestos.</w:t>
+      </w:r>
+    </w:p>
+    <w:p>
+      <w:pPr>
+        <w:pStyle w:val="Normal"/>
+        <w:spacing w:before="0" w:after="160"/>
+        <w:rPr>
+          <w:rFonts w:eastAsia="Arial" w:cs="Arial"/>
+          <w:color w:val="1C1C1C"/>
+          <w:sz w:val="22"/>
+          <w:szCs w:val="22"/>
+        </w:rPr>
+      </w:pPr>
+      <w:r>
+        <w:rPr>
+          <w:rFonts w:eastAsia="Arial" w:cs="Arial"/>
+          <w:color w:val="1C1C1C"/>
+          <w:sz w:val="22"/>
+          <w:szCs w:val="22"/>
+        </w:rPr>
+        <w:t>(2) Bloque de información con nombre del campeonato, fecha de inicio y fin, ubicación, nivel y descripción completa.</w:t>
+      </w:r>
+    </w:p>
+    <w:p>
+      <w:pPr>
+        <w:pStyle w:val="Normal"/>
+        <w:spacing w:before="0" w:after="160"/>
+        <w:rPr>
+          <w:rFonts w:eastAsia="Arial" w:cs="Arial"/>
+          <w:color w:val="1C1C1C"/>
+          <w:sz w:val="22"/>
+          <w:szCs w:val="22"/>
+        </w:rPr>
+      </w:pPr>
+      <w:r>
+        <w:rPr>
+          <w:rFonts w:eastAsia="Arial" w:cs="Arial"/>
+          <w:color w:val="1C1C1C"/>
+          <w:sz w:val="22"/>
+          <w:szCs w:val="22"/>
+        </w:rPr>
+        <w:t xml:space="preserve">(3) Sección de categorías dividida en dos columnas (Masculino / Femenino), y dentro de cada columna las categorías agrupadas por modalidad (Kata / Kumite). Cada categoría se muestra como un ítem clicable que abre el modal de inscritos. Junto a cada categoría hay un botón 'Ver sorteo' que navega a la ruta del </w:t>
+      </w:r>
+      <w:r>
+        <w:rPr>
+          <w:rFonts w:eastAsia="Arial" w:cs="Arial"/>
+          <w:color w:val="1C1C1C"/>
+          <w:sz w:val="22"/>
+          <w:szCs w:val="22"/>
+        </w:rPr>
+        <w:t>sorteo</w:t>
+      </w:r>
+      <w:r>
+        <w:rPr>
+          <w:rFonts w:eastAsia="Arial" w:cs="Arial"/>
+          <w:color w:val="1C1C1C"/>
+          <w:sz w:val="22"/>
+          <w:szCs w:val="22"/>
+        </w:rPr>
+        <w:t>.</w:t>
       </w:r>
     </w:p>
     <w:p>
@@ -26597,7 +26699,7 @@
           <w:sz w:val="22"/>
           <w:szCs w:val="22"/>
         </w:rPr>
-        <w:t>Al hacer clic en una categoría desde el detalle del campeonato, se abre un modal (panel lateral o diálogo central según el viewport) que muestra la lista de competidores inscritos en esa categoría, con su nombre y club. Si el campeonato está en estado 'futuro' (inscripciones abiertas), se muestra un botón 'Inscribirse' que abre el flujo de inscripción.</w:t>
+        <w:t>Al hacer clic en una categoría desde el detalle del campeonato, se abre un modal que muestra la lista de competidores inscritos en esa categoría, con su nombre y club. Si el campeonato está en estado 'futuro', se muestra un botón 'Inscribirse' que abre el flujo de inscripción.</w:t>
       </w:r>
     </w:p>
     <w:p>
@@ -26661,7 +26763,7 @@
           <w:sz w:val="22"/>
           <w:szCs w:val="22"/>
         </w:rPr>
-        <w:t>Paso 'elegir': Dos botones para elegir entre 'Ya tengo cuenta' (flujo → 'login') y 'Crear cuenta nueva' (flujo → 'registro'). Si ya hay sesión activa, este paso se omite y se salta directamente a 'categorias'.</w:t>
+        <w:t>Paso 'elegir': Dos botones para elegir entre 'Ya tengo cuenta' (flujo → 'login') y 'Crear cuenta nueva' (flujo → 'registro'). Si hay sesión activa, este paso se omite y se salta directamente a 'categorias'.</w:t>
       </w:r>
     </w:p>
     <w:p>
@@ -26681,7 +26783,7 @@
           <w:sz w:val="22"/>
           <w:szCs w:val="22"/>
         </w:rPr>
-        <w:t>Paso 'login': Formulario con campos DNI y contraseña. El DNI se valida en tiempo real con el ValidadorService (formato 8 dígitos + letra). Botón 'Iniciar sesión' hace POST a /api/usuarios/login-competidor. Errores de credenciales se muestran con banner rojo.</w:t>
+        <w:t>Paso 'login': Formulario con campos DNI y contraseña. El DNI se valida en tiempo real con el ValidadorService. Botón 'Iniciar sesión' hace POST a /api/usuarios/login-competidor. Errores de credenciales se muestran con banner rojo.</w:t>
       </w:r>
     </w:p>
     <w:p>
@@ -26721,7 +26823,7 @@
           <w:sz w:val="22"/>
           <w:szCs w:val="22"/>
         </w:rPr>
-        <w:t>Paso 'categorias': Muestra las categorías disponibles filtradas por el género del competidor autenticado, separadas en Kumite y Kata. Las ya inscritas aparecen con chip verde y no son seleccionables. Las disponibles permiten selección múltiple con toggle. Indicador del número de categorías seleccionadas.</w:t>
+        <w:t>Paso 'categorias': Muestra las categorías disponibles filtradas por el género del competidor, separadas en Kumite y Kata. Las ya inscritas aparecen con chip verde y no son seleccionables.</w:t>
       </w:r>
     </w:p>
     <w:p>
@@ -26741,7 +26843,34 @@
           <w:sz w:val="22"/>
           <w:szCs w:val="22"/>
         </w:rPr>
-        <w:t>Paso 'confirmar': Muestra el resumen de las categorías seleccionadas. Incluye el bloque de consentimiento RGPD (radio button con texto legal). El botón 'Confirmar inscripción' solo se activa si se ha dado el consentimiento. Hace POST a /api/inscripciones para cada categoría seleccionada en paralelo.</w:t>
+        <w:t xml:space="preserve">Paso 'confirmar': Muestra el resumen de las categorías seleccionadas. Incluye el bloque de consentimiento </w:t>
+      </w:r>
+      <w:r>
+        <w:rPr>
+          <w:rFonts w:eastAsia="Arial" w:cs="Arial"/>
+          <w:color w:val="1C1C1C"/>
+          <w:sz w:val="22"/>
+          <w:szCs w:val="22"/>
+        </w:rPr>
+        <w:t>de protección de datos</w:t>
+      </w:r>
+      <w:r>
+        <w:rPr>
+          <w:rFonts w:eastAsia="Arial" w:cs="Arial"/>
+          <w:color w:val="1C1C1C"/>
+          <w:sz w:val="22"/>
+          <w:szCs w:val="22"/>
+        </w:rPr>
+        <w:t>. El botón 'Confirmar inscripción' solo se activa si se ha dado el consentimiento. Hace POST a /api/inscripciones para cada categoría seleccionada en paralelo.</w:t>
+      </w:r>
+    </w:p>
+    <w:p>
+      <w:pPr>
+        <w:pStyle w:val="Normal"/>
+        <w:rPr/>
+      </w:pPr>
+      <w:r>
+        <w:rPr/>
       </w:r>
     </w:p>
     <w:p>
@@ -26769,7 +26898,7 @@
           <w:szCs w:val="22"/>
           <w:u w:val="single"/>
         </w:rPr>
-        <w:t>Pantalla 5: Bracket / Sorteo (/campeonato/:id/categoria/:idCat/sorteo)</w:t>
+        <w:t>Pantalla 5: Sorteo (/campeonato/:id/categoria/:idCat/sorteo)</w:t>
       </w:r>
     </w:p>
     <w:p>
@@ -26829,7 +26958,7 @@
           <w:sz w:val="22"/>
           <w:szCs w:val="22"/>
         </w:rPr>
-        <w:t>Página minimalista centrada verticalmente con fondo #06080F. Contiene un logo o título de la aplicación, un formulario con campos DNI y contraseña (con opción de mostrar/ocultar contraseña mediante el icono de ojo), y un botón 'Iniciar sesión'. Los errores (credenciales incorrectas, rol no administrador) se muestran con un banner rojo debajo del formulario. En caso de éxito, el router navega automáticamente a /admin/campeonatos.</w:t>
+        <w:t>Página minimalista centrada verticalmente con fondo #06080F. Contiene un formulario con campos DNI y contraseña, y un botón 'Iniciar sesión'. Los errores (credenciales incorrectas, rol no administrador) se muestran con un banner rojo debajo del formulario. En caso de éxito, el router navega automáticamente a /admin/campeonatos.</w:t>
       </w:r>
     </w:p>
     <w:p>
@@ -26873,7 +27002,25 @@
           <w:sz w:val="22"/>
           <w:szCs w:val="22"/>
         </w:rPr>
-        <w:t>Panel de administración protegido por el guard canActivate. Tiene una barra de herramientas con: campo de búsqueda en tiempo real (filtrado por nombre y ubicación), y botón 'Nuevo campeonato'. La lista de campeonatos se muestra en una tabla (nombre, fechas, ubicación, nivel, estado) con acciones editar (icono lápiz) y eliminar (icono papelera) por fila. Al pulsar 'Nuevo campeonato' o el icono de edición, se abre un modal con el formulario ReactiveForm completo: nombre, fecha inicio, fecha fin, ubicación, nivel (select), estado (select) y URL de portada. Debajo del formulario hay un selector de categorías agrupado por grupo de edad (Junior, Senior, etc.) con subcolumnas masculino y femenino. Cada categoría tiene un checkbox. Las categorías seleccionadas se envían junto con los datos del campeonato al guardar (POST categorías uno a uno mediante la API de campeonato_categoria). Al pulsar eliminar, se abre un modal de confirmación antes de ejecutar el DELETE.</w:t>
+        <w:t>Panel de administración protegido por el guard canActivate. Tiene una barra de herramientas con: campo de búsqueda en tiempo real, y botón 'Nuevo campeonato'. La lista de campeonatos se muestra en una tabla con acciones editar y eliminar por fila. Al pulsar 'Nuevo campeonato' o el icono de edición, se abre un modal con el formulario ReactiveForm completo: nombre, fecha inicio, fecha fin, ubicación, nivel, estado y URL de portada. Debajo del formulario hay un selector de categorías agrupado por grupo de edad con subcolumnas masculino y femenino. Cada categoría tiene un checkbo</w:t>
+      </w:r>
+      <w:r>
+        <w:rPr>
+          <w:rFonts w:eastAsia="Arial" w:cs="Arial"/>
+          <w:color w:val="1C1C1C"/>
+          <w:sz w:val="22"/>
+          <w:szCs w:val="22"/>
+        </w:rPr>
+        <w:t>x</w:t>
+      </w:r>
+      <w:r>
+        <w:rPr>
+          <w:rFonts w:eastAsia="Arial" w:cs="Arial"/>
+          <w:color w:val="1C1C1C"/>
+          <w:sz w:val="22"/>
+          <w:szCs w:val="22"/>
+        </w:rPr>
+        <w:t xml:space="preserve"> categorías seleccionadas se envían junto con los datos del campeonato al guardar. Al pulsar eliminar, se abre un modal de confirmación antes de ejecutar el DELETE.</w:t>
       </w:r>
     </w:p>
     <w:p>
@@ -26917,7 +27064,7 @@
           <w:sz w:val="22"/>
           <w:szCs w:val="22"/>
         </w:rPr>
-        <w:t>Panel de administración similar al de campeonatos. Tiene barra de búsqueda (filtra por nombre, DNI y email simultáneamente) y un select de filtro por rol (Todos, Administradores, Árbitros, Competidores). La tabla muestra: nombre completo, DNI, email, rol (badge con color distinto por rol: rojo admin, ámbar árbitro, azul competidor) y fecha de nacimiento. Las acciones de edición y eliminación funcionan igual que en la pantalla de campeonatos. El formulario de usuario incluye: nombre, apellidos, DNI (validado con regex), email, contraseña (opcional en edición, con indicación '(dejar vacío para no cambiar)'), rol (select), y género (select M/F).</w:t>
+        <w:t>Panel de administración similar al de campeonatos. Tiene barra de búsqueda y un select de filtro por rol. La tabla muestra: nombre completo, DNI, email, rol y fecha de nacimiento. Las acciones de edición y eliminación funcionan igual que en la pantalla de campeonatos. El formulario de usuario incluye: nombre, apellidos, DNI, email, contraseña, rol y género.</w:t>
       </w:r>
     </w:p>
     <w:p>
@@ -26960,7 +27107,7 @@
           <w:sz w:val="22"/>
           <w:szCs w:val="22"/>
         </w:rPr>
-        <w:t>En la versión actual de CampeonatoLive no se generan documentos de informe externos (PDF, Excel, etc.). Todos los listados y consultas se presentan directamente en la interfaz web con los siguientes formatos:</w:t>
+        <w:t>En la versión actual de CampeonatoLive no se generan documentos de informe externos. Todos los listados y consultas se presentan directamente en la interfaz web con los siguientes formatos:</w:t>
       </w:r>
     </w:p>
     <w:p>
@@ -26988,8 +27135,7 @@
       <w:tblGrid>
         <w:gridCol w:w="2196"/>
         <w:gridCol w:w="2204"/>
-        <w:gridCol w:w="2500"/>
-        <w:gridCol w:w="2126"/>
+        <w:gridCol w:w="4626"/>
       </w:tblGrid>
       <w:tr>
         <w:trPr>
@@ -27039,11 +27185,12 @@
         </w:tc>
         <w:tc>
           <w:tcPr>
-            <w:tcW w:w="2500" w:type="dxa"/>
-            <w:tcBorders>
-              <w:top w:val="single" w:sz="2" w:space="0" w:color="CCCCCC"/>
-              <w:start w:val="single" w:sz="2" w:space="0" w:color="CCCCCC"/>
-              <w:bottom w:val="single" w:sz="2" w:space="0" w:color="CCCCCC"/>
+            <w:tcW w:w="4626" w:type="dxa"/>
+            <w:tcBorders>
+              <w:top w:val="single" w:sz="2" w:space="0" w:color="CCCCCC"/>
+              <w:start w:val="single" w:sz="2" w:space="0" w:color="CCCCCC"/>
+              <w:bottom w:val="single" w:sz="2" w:space="0" w:color="CCCCCC"/>
+              <w:end w:val="single" w:sz="2" w:space="0" w:color="CCCCCC"/>
             </w:tcBorders>
             <w:shd w:fill="8D281E" w:val="clear"/>
           </w:tcPr>
@@ -27055,27 +27202,6 @@
             <w:r>
               <w:rPr/>
               <w:t>Datos mostrados</w:t>
-            </w:r>
-          </w:p>
-        </w:tc>
-        <w:tc>
-          <w:tcPr>
-            <w:tcW w:w="2126" w:type="dxa"/>
-            <w:tcBorders>
-              <w:top w:val="single" w:sz="2" w:space="0" w:color="CCCCCC"/>
-              <w:start w:val="single" w:sz="2" w:space="0" w:color="CCCCCC"/>
-              <w:bottom w:val="single" w:sz="2" w:space="0" w:color="CCCCCC"/>
-            </w:tcBorders>
-            <w:shd w:fill="8D281E" w:val="clear"/>
-          </w:tcPr>
-          <w:p>
-            <w:pPr>
-              <w:pStyle w:val="Tablas"/>
-              <w:rPr/>
-            </w:pPr>
-            <w:r>
-              <w:rPr/>
-              <w:t>Filtros disponibles</w:t>
             </w:r>
           </w:p>
         </w:tc>
@@ -27138,7 +27264,7 @@
         </w:tc>
         <w:tc>
           <w:tcPr>
-            <w:tcW w:w="2500" w:type="dxa"/>
+            <w:tcW w:w="4626" w:type="dxa"/>
             <w:tcBorders>
               <w:top w:val="single" w:sz="2" w:space="0" w:color="CCCCCC"/>
               <w:start w:val="single" w:sz="2" w:space="0" w:color="CCCCCC"/>
@@ -27160,33 +27286,6 @@
                 <w:szCs w:val="20"/>
               </w:rPr>
               <w:t>Portada, nombre, nivel, estado, fechas, ubicación.</w:t>
-            </w:r>
-          </w:p>
-        </w:tc>
-        <w:tc>
-          <w:tcPr>
-            <w:tcW w:w="2126" w:type="dxa"/>
-            <w:tcBorders>
-              <w:top w:val="single" w:sz="2" w:space="0" w:color="CCCCCC"/>
-              <w:start w:val="single" w:sz="2" w:space="0" w:color="CCCCCC"/>
-              <w:bottom w:val="single" w:sz="2" w:space="0" w:color="CCCCCC"/>
-              <w:end w:val="single" w:sz="2" w:space="0" w:color="CCCCCC"/>
-            </w:tcBorders>
-            <w:shd w:fill="FAFAFA" w:val="clear"/>
-          </w:tcPr>
-          <w:p>
-            <w:pPr>
-              <w:pStyle w:val="Normal"/>
-              <w:rPr/>
-            </w:pPr>
-            <w:r>
-              <w:rPr>
-                <w:rFonts w:eastAsia="Arial" w:cs="Arial"/>
-                <w:color w:val="1C1C1C"/>
-                <w:sz w:val="20"/>
-                <w:szCs w:val="20"/>
-              </w:rPr>
-              <w:t>Búsqueda por nombre en tiempo real.</w:t>
             </w:r>
           </w:p>
         </w:tc>
@@ -27249,7 +27348,7 @@
         </w:tc>
         <w:tc>
           <w:tcPr>
-            <w:tcW w:w="2500" w:type="dxa"/>
+            <w:tcW w:w="4626" w:type="dxa"/>
             <w:tcBorders>
               <w:top w:val="single" w:sz="2" w:space="0" w:color="CCCCCC"/>
               <w:start w:val="single" w:sz="2" w:space="0" w:color="CCCCCC"/>
@@ -27271,33 +27370,6 @@
                 <w:szCs w:val="20"/>
               </w:rPr>
               <w:t>Nombre completo y club de cada competidor inscrito.</w:t>
-            </w:r>
-          </w:p>
-        </w:tc>
-        <w:tc>
-          <w:tcPr>
-            <w:tcW w:w="2126" w:type="dxa"/>
-            <w:tcBorders>
-              <w:top w:val="single" w:sz="2" w:space="0" w:color="CCCCCC"/>
-              <w:start w:val="single" w:sz="2" w:space="0" w:color="CCCCCC"/>
-              <w:bottom w:val="single" w:sz="2" w:space="0" w:color="CCCCCC"/>
-              <w:end w:val="single" w:sz="2" w:space="0" w:color="CCCCCC"/>
-            </w:tcBorders>
-            <w:shd w:fill="F2F2F2" w:val="clear"/>
-          </w:tcPr>
-          <w:p>
-            <w:pPr>
-              <w:pStyle w:val="Normal"/>
-              <w:rPr/>
-            </w:pPr>
-            <w:r>
-              <w:rPr>
-                <w:rFonts w:eastAsia="Arial" w:cs="Arial"/>
-                <w:color w:val="1C1C1C"/>
-                <w:sz w:val="20"/>
-                <w:szCs w:val="20"/>
-              </w:rPr>
-              <w:t>Ninguno (se muestran todos).</w:t>
             </w:r>
           </w:p>
         </w:tc>
@@ -27360,7 +27432,7 @@
         </w:tc>
         <w:tc>
           <w:tcPr>
-            <w:tcW w:w="2500" w:type="dxa"/>
+            <w:tcW w:w="4626" w:type="dxa"/>
             <w:tcBorders>
               <w:top w:val="single" w:sz="2" w:space="0" w:color="CCCCCC"/>
               <w:start w:val="single" w:sz="2" w:space="0" w:color="CCCCCC"/>
@@ -27382,33 +27454,6 @@
                 <w:szCs w:val="20"/>
               </w:rPr>
               <w:t>Nombre y club de competidores, puntuaciones, estado por combate, ronda.</w:t>
-            </w:r>
-          </w:p>
-        </w:tc>
-        <w:tc>
-          <w:tcPr>
-            <w:tcW w:w="2126" w:type="dxa"/>
-            <w:tcBorders>
-              <w:top w:val="single" w:sz="2" w:space="0" w:color="CCCCCC"/>
-              <w:start w:val="single" w:sz="2" w:space="0" w:color="CCCCCC"/>
-              <w:bottom w:val="single" w:sz="2" w:space="0" w:color="CCCCCC"/>
-              <w:end w:val="single" w:sz="2" w:space="0" w:color="CCCCCC"/>
-            </w:tcBorders>
-            <w:shd w:fill="FAFAFA" w:val="clear"/>
-          </w:tcPr>
-          <w:p>
-            <w:pPr>
-              <w:pStyle w:val="Normal"/>
-              <w:rPr/>
-            </w:pPr>
-            <w:r>
-              <w:rPr>
-                <w:rFonts w:eastAsia="Arial" w:cs="Arial"/>
-                <w:color w:val="1C1C1C"/>
-                <w:sz w:val="20"/>
-                <w:szCs w:val="20"/>
-              </w:rPr>
-              <w:t>Solo se muestra R1 en campeonatos 'futuro'.</w:t>
             </w:r>
           </w:p>
         </w:tc>
@@ -27471,7 +27516,7 @@
         </w:tc>
         <w:tc>
           <w:tcPr>
-            <w:tcW w:w="2500" w:type="dxa"/>
+            <w:tcW w:w="4626" w:type="dxa"/>
             <w:tcBorders>
               <w:top w:val="single" w:sz="2" w:space="0" w:color="CCCCCC"/>
               <w:start w:val="single" w:sz="2" w:space="0" w:color="CCCCCC"/>
@@ -27493,33 +27538,6 @@
                 <w:szCs w:val="20"/>
               </w:rPr>
               <w:t>Nombre, fechas, ubicación, nivel, estado.</w:t>
-            </w:r>
-          </w:p>
-        </w:tc>
-        <w:tc>
-          <w:tcPr>
-            <w:tcW w:w="2126" w:type="dxa"/>
-            <w:tcBorders>
-              <w:top w:val="single" w:sz="2" w:space="0" w:color="CCCCCC"/>
-              <w:start w:val="single" w:sz="2" w:space="0" w:color="CCCCCC"/>
-              <w:bottom w:val="single" w:sz="2" w:space="0" w:color="CCCCCC"/>
-              <w:end w:val="single" w:sz="2" w:space="0" w:color="CCCCCC"/>
-            </w:tcBorders>
-            <w:shd w:fill="F2F2F2" w:val="clear"/>
-          </w:tcPr>
-          <w:p>
-            <w:pPr>
-              <w:pStyle w:val="Normal"/>
-              <w:rPr/>
-            </w:pPr>
-            <w:r>
-              <w:rPr>
-                <w:rFonts w:eastAsia="Arial" w:cs="Arial"/>
-                <w:color w:val="1C1C1C"/>
-                <w:sz w:val="20"/>
-                <w:szCs w:val="20"/>
-              </w:rPr>
-              <w:t>Búsqueda por nombre y ubicación.</w:t>
             </w:r>
           </w:p>
         </w:tc>
@@ -27582,7 +27600,7 @@
         </w:tc>
         <w:tc>
           <w:tcPr>
-            <w:tcW w:w="2500" w:type="dxa"/>
+            <w:tcW w:w="4626" w:type="dxa"/>
             <w:tcBorders>
               <w:top w:val="single" w:sz="2" w:space="0" w:color="CCCCCC"/>
               <w:start w:val="single" w:sz="2" w:space="0" w:color="CCCCCC"/>
@@ -27604,33 +27622,6 @@
                 <w:szCs w:val="20"/>
               </w:rPr>
               <w:t>Nombre, apellidos, DNI, email, rol, fecha nacimiento.</w:t>
-            </w:r>
-          </w:p>
-        </w:tc>
-        <w:tc>
-          <w:tcPr>
-            <w:tcW w:w="2126" w:type="dxa"/>
-            <w:tcBorders>
-              <w:top w:val="single" w:sz="2" w:space="0" w:color="CCCCCC"/>
-              <w:start w:val="single" w:sz="2" w:space="0" w:color="CCCCCC"/>
-              <w:bottom w:val="single" w:sz="2" w:space="0" w:color="CCCCCC"/>
-              <w:end w:val="single" w:sz="2" w:space="0" w:color="CCCCCC"/>
-            </w:tcBorders>
-            <w:shd w:fill="FAFAFA" w:val="clear"/>
-          </w:tcPr>
-          <w:p>
-            <w:pPr>
-              <w:pStyle w:val="Normal"/>
-              <w:rPr/>
-            </w:pPr>
-            <w:r>
-              <w:rPr>
-                <w:rFonts w:eastAsia="Arial" w:cs="Arial"/>
-                <w:color w:val="1C1C1C"/>
-                <w:sz w:val="20"/>
-                <w:szCs w:val="20"/>
-              </w:rPr>
-              <w:t>Búsqueda por nombre/DNI/email + filtro por rol.</w:t>
             </w:r>
           </w:p>
         </w:tc>
@@ -27723,7 +27714,7 @@
           <w:sz w:val="22"/>
           <w:szCs w:val="22"/>
         </w:rPr>
-        <w:t>Abre el navegador web (Chrome, Firefox, Edge o Safari) y accede a campeonatolive.online.</w:t>
+        <w:t>Abre el navegador web y accede a campeonatolive.online.</w:t>
       </w:r>
     </w:p>
     <w:p>
@@ -27803,7 +27794,25 @@
           <w:sz w:val="22"/>
           <w:szCs w:val="22"/>
         </w:rPr>
-        <w:t>Desde la página de detalle, pulsa el botón 'Ver sorteo' de una categoría para ver el bracket de eliminación directa con todos los enfrentamientos y sus resultados.</w:t>
+        <w:t xml:space="preserve">Desde la página de detalle, pulsa el botón 'Ver sorteo' de una categoría para ver el </w:t>
+      </w:r>
+      <w:r>
+        <w:rPr>
+          <w:rFonts w:eastAsia="Arial" w:cs="Arial"/>
+          <w:color w:val="1C1C1C"/>
+          <w:sz w:val="22"/>
+          <w:szCs w:val="22"/>
+        </w:rPr>
+        <w:t>sorteo</w:t>
+      </w:r>
+      <w:r>
+        <w:rPr>
+          <w:rFonts w:eastAsia="Arial" w:cs="Arial"/>
+          <w:color w:val="1C1C1C"/>
+          <w:sz w:val="22"/>
+          <w:szCs w:val="22"/>
+        </w:rPr>
+        <w:t xml:space="preserve"> con todos los enfrentamientos y sus resultados.</w:t>
       </w:r>
     </w:p>
     <w:p>
@@ -28037,7 +28046,7 @@
           <w:sz w:val="22"/>
           <w:szCs w:val="22"/>
         </w:rPr>
-        <w:t>Si las credenciales son correctas y tu rol es ADMIN o ARBITRO, serás redirigido al panel de administración (/admin/campeonatos).</w:t>
+        <w:t>Si las credenciales son correctas y tu rol es ADMIN, serás redirigido al panel de administración (/admin/campeonatos).</w:t>
       </w:r>
     </w:p>
     <w:p>
@@ -28077,7 +28086,7 @@
           <w:sz w:val="22"/>
           <w:szCs w:val="22"/>
         </w:rPr>
-        <w:t>Gestión de usuarios: Navega a /admin/usuarios. Usa el buscador y el filtro de rol para encontrar usuarios. Pulsa 'Nuevo usuario' para crear competidores, árbitros u otros administradores. Selecciona el rol apropiado. Los árbitros deben tener número de licencia y categoría arbitral. Para editar o eliminar, usa los iconos de la fila.</w:t>
+        <w:t>Gestión de usuarios: Navega a /admin/usuarios. Usa el buscador y el filtro de rol para encontrar usuarios. Pulsa 'Nuevo usuario' para crear competidores, árbitros u otros administradores. Selecciona el rol apropiado. Para editar o eliminar, usa los iconos de la fila.</w:t>
       </w:r>
     </w:p>
     <w:p>
@@ -28098,15 +28107,6 @@
           <w:szCs w:val="22"/>
         </w:rPr>
         <w:t>Para cerrar sesión, pulsa el botón 'Cerrar sesión' en el encabezado del panel.</w:t>
-      </w:r>
-    </w:p>
-    <w:p>
-      <w:pPr>
-        <w:pStyle w:val="Normal"/>
-        <w:rPr/>
-      </w:pPr>
-      <w:r>
-        <w:rPr/>
       </w:r>
       <w:r>
         <w:br w:type="page"/>

</xml_diff>